<commit_message>
Final commit (I hope so). Changed report file again, added PR links
</commit_message>
<xml_diff>
--- a/ai_14/artiemii_paliei/epic_2/epic_2_report_artiemii_paliei.docx
+++ b/ai_14/artiemii_paliei/epic_2/epic_2_report_artiemii_paliei.docx
@@ -17363,26 +17363,14 @@
         </w:rPr>
         <w:t>:</w:t>
       </w:r>
-    </w:p>
-    <w:p>
-      <w:pPr>
-        <w:rPr>
-          <w:rFonts w:ascii="Times New Roman" w:eastAsia="Times New Roman" w:hAnsi="Times New Roman" w:cs="Times New Roman"/>
-          <w:sz w:val="24"/>
-          <w:szCs w:val="24"/>
-          <w:lang w:val="uk-UA"/>
-        </w:rPr>
-      </w:pPr>
-    </w:p>
-    <w:p>
-      <w:pPr>
-        <w:rPr>
-          <w:rFonts w:ascii="Times New Roman" w:eastAsia="Times New Roman" w:hAnsi="Times New Roman" w:cs="Times New Roman"/>
-          <w:sz w:val="24"/>
-          <w:szCs w:val="24"/>
-          <w:lang w:val="uk-UA"/>
-        </w:rPr>
-      </w:pPr>
+      <w:hyperlink r:id="rId25" w:history="1">
+        <w:r>
+          <w:rPr>
+            <w:rStyle w:val="ae"/>
+          </w:rPr>
+          <w:t>https://github.com/artificial-intelligence-department/ai_programming_playground_2026/pull/258/changes - diff-1a22111c1eee6f6be53e1041a0b7008b191f77236e4a627fb13ecf68c6fe0c9b</w:t>
+        </w:r>
+      </w:hyperlink>
     </w:p>
     <w:p>
       <w:pPr>
@@ -19267,26 +19255,14 @@
         </w:rPr>
         <w:t>:</w:t>
       </w:r>
-    </w:p>
-    <w:p>
-      <w:pPr>
-        <w:rPr>
-          <w:rFonts w:ascii="Times New Roman" w:eastAsia="Times New Roman" w:hAnsi="Times New Roman" w:cs="Times New Roman"/>
-          <w:sz w:val="24"/>
-          <w:szCs w:val="24"/>
-          <w:lang w:val="uk-UA"/>
-        </w:rPr>
-      </w:pPr>
-    </w:p>
-    <w:p>
-      <w:pPr>
-        <w:rPr>
-          <w:rFonts w:ascii="Times New Roman" w:eastAsia="Times New Roman" w:hAnsi="Times New Roman" w:cs="Times New Roman"/>
-          <w:sz w:val="24"/>
-          <w:szCs w:val="24"/>
-          <w:lang w:val="uk-UA"/>
-        </w:rPr>
-      </w:pPr>
+      <w:hyperlink r:id="rId26" w:history="1">
+        <w:r>
+          <w:rPr>
+            <w:rStyle w:val="ae"/>
+          </w:rPr>
+          <w:t>https://github.com/artificial-intelligence-department/ai_programming_playground_2026/pull/258/changes - diff-c3ff815428a2626c20e1a1c1b8c8727ae037dcbf14506dacf4adc56a60872fe1</w:t>
+        </w:r>
+      </w:hyperlink>
     </w:p>
     <w:p>
       <w:pPr>
@@ -22514,9 +22490,7 @@
     <w:p>
       <w:pPr>
         <w:rPr>
-          <w:rFonts w:ascii="Times New Roman" w:eastAsia="Times New Roman" w:hAnsi="Times New Roman" w:cs="Times New Roman"/>
-          <w:sz w:val="24"/>
-          <w:szCs w:val="24"/>
+          <w:rFonts w:ascii="Times New Roman" w:hAnsi="Times New Roman" w:cs="Times New Roman"/>
           <w:lang w:val="uk-UA"/>
         </w:rPr>
       </w:pPr>
@@ -22550,22 +22524,14 @@
         </w:rPr>
         <w:t>:</w:t>
       </w:r>
-    </w:p>
-    <w:p>
-      <w:pPr>
-        <w:rPr>
-          <w:rFonts w:ascii="Times New Roman" w:hAnsi="Times New Roman" w:cs="Times New Roman"/>
-          <w:lang w:val="uk-UA"/>
-        </w:rPr>
-      </w:pPr>
-    </w:p>
-    <w:p>
-      <w:pPr>
-        <w:rPr>
-          <w:rFonts w:ascii="Times New Roman" w:hAnsi="Times New Roman" w:cs="Times New Roman"/>
-          <w:lang w:val="uk-UA"/>
-        </w:rPr>
-      </w:pPr>
+      <w:hyperlink r:id="rId27" w:history="1">
+        <w:r>
+          <w:rPr>
+            <w:rStyle w:val="ae"/>
+          </w:rPr>
+          <w:t>https://github.com/artificial-intelligence-department/ai_programming_playground_2026/pull/258/changes - diff-5bfeb18d390bac24245f7fc30c157057be7daa451852f3fac29ea18d9a161d05</w:t>
+        </w:r>
+      </w:hyperlink>
     </w:p>
     <w:p>
       <w:pPr>
@@ -32907,9 +32873,7 @@
     <w:p>
       <w:pPr>
         <w:rPr>
-          <w:rFonts w:ascii="Times New Roman" w:eastAsia="Times New Roman" w:hAnsi="Times New Roman" w:cs="Times New Roman"/>
-          <w:sz w:val="24"/>
-          <w:szCs w:val="24"/>
+          <w:rFonts w:ascii="Times New Roman" w:hAnsi="Times New Roman" w:cs="Times New Roman"/>
           <w:lang w:val="uk-UA"/>
         </w:rPr>
       </w:pPr>
@@ -32943,22 +32907,14 @@
         </w:rPr>
         <w:t>:</w:t>
       </w:r>
-    </w:p>
-    <w:p>
-      <w:pPr>
-        <w:rPr>
-          <w:rFonts w:ascii="Times New Roman" w:hAnsi="Times New Roman" w:cs="Times New Roman"/>
-          <w:lang w:val="uk-UA"/>
-        </w:rPr>
-      </w:pPr>
-    </w:p>
-    <w:p>
-      <w:pPr>
-        <w:rPr>
-          <w:rFonts w:ascii="Times New Roman" w:hAnsi="Times New Roman" w:cs="Times New Roman"/>
-          <w:lang w:val="uk-UA"/>
-        </w:rPr>
-      </w:pPr>
+      <w:hyperlink r:id="rId28" w:history="1">
+        <w:r>
+          <w:rPr>
+            <w:rStyle w:val="ae"/>
+          </w:rPr>
+          <w:t>https://github.com/artificial-intelligence-department/ai_programming_playground_2026/pull/258/changes - diff-082bb82e72567688c55a3618eda03dd78d3aa6614c6aa966c156f3b62e1e521a</w:t>
+        </w:r>
+      </w:hyperlink>
     </w:p>
     <w:p>
       <w:pPr>
@@ -34580,9 +34536,7 @@
     <w:p>
       <w:pPr>
         <w:rPr>
-          <w:rFonts w:ascii="Times New Roman" w:eastAsia="Times New Roman" w:hAnsi="Times New Roman" w:cs="Times New Roman"/>
-          <w:sz w:val="24"/>
-          <w:szCs w:val="24"/>
+          <w:rFonts w:ascii="Times New Roman" w:hAnsi="Times New Roman" w:cs="Times New Roman"/>
           <w:lang w:val="uk-UA"/>
         </w:rPr>
       </w:pPr>
@@ -34616,22 +34570,14 @@
         </w:rPr>
         <w:t>:</w:t>
       </w:r>
-    </w:p>
-    <w:p>
-      <w:pPr>
-        <w:rPr>
-          <w:rFonts w:ascii="Times New Roman" w:hAnsi="Times New Roman" w:cs="Times New Roman"/>
-          <w:lang w:val="uk-UA"/>
-        </w:rPr>
-      </w:pPr>
-    </w:p>
-    <w:p>
-      <w:pPr>
-        <w:rPr>
-          <w:rFonts w:ascii="Times New Roman" w:hAnsi="Times New Roman" w:cs="Times New Roman"/>
-          <w:lang w:val="uk-UA"/>
-        </w:rPr>
-      </w:pPr>
+      <w:hyperlink r:id="rId29" w:history="1">
+        <w:r>
+          <w:rPr>
+            <w:rStyle w:val="ae"/>
+          </w:rPr>
+          <w:t>https://github.com/artificial-intelligence-department/ai_programming_playground_2026/pull/258/changes - diff-c21436fc322e9b705ea1175de0b4b51fed94756d756f6d9334578f92f7fa103d</w:t>
+        </w:r>
+      </w:hyperlink>
     </w:p>
     <w:p>
       <w:pPr>
@@ -36994,9 +36940,7 @@
     <w:p>
       <w:pPr>
         <w:rPr>
-          <w:rFonts w:ascii="Times New Roman" w:eastAsia="Times New Roman" w:hAnsi="Times New Roman" w:cs="Times New Roman"/>
-          <w:sz w:val="24"/>
-          <w:szCs w:val="24"/>
+          <w:rFonts w:ascii="Times New Roman" w:hAnsi="Times New Roman" w:cs="Times New Roman"/>
           <w:lang w:val="uk-UA"/>
         </w:rPr>
       </w:pPr>
@@ -37030,22 +36974,14 @@
         </w:rPr>
         <w:t>:</w:t>
       </w:r>
-    </w:p>
-    <w:p>
-      <w:pPr>
-        <w:rPr>
-          <w:rFonts w:ascii="Times New Roman" w:hAnsi="Times New Roman" w:cs="Times New Roman"/>
-          <w:lang w:val="uk-UA"/>
-        </w:rPr>
-      </w:pPr>
-    </w:p>
-    <w:p>
-      <w:pPr>
-        <w:rPr>
-          <w:rFonts w:ascii="Times New Roman" w:hAnsi="Times New Roman" w:cs="Times New Roman"/>
-          <w:lang w:val="uk-UA"/>
-        </w:rPr>
-      </w:pPr>
+      <w:hyperlink r:id="rId30" w:history="1">
+        <w:r>
+          <w:rPr>
+            <w:rStyle w:val="ae"/>
+          </w:rPr>
+          <w:t>https://github.com/artificial-intelligence-department/ai_programming_playground_2026/pull/258/changes - diff-31ed352d774fbafba86ad94794f4b9164e914252646c95a1c448de25a22ef91f</w:t>
+        </w:r>
+      </w:hyperlink>
     </w:p>
     <w:p>
       <w:pPr>
@@ -38649,9 +38585,7 @@
     <w:p>
       <w:pPr>
         <w:rPr>
-          <w:rFonts w:ascii="Times New Roman" w:eastAsia="Times New Roman" w:hAnsi="Times New Roman" w:cs="Times New Roman"/>
-          <w:sz w:val="24"/>
-          <w:szCs w:val="24"/>
+          <w:rFonts w:ascii="Times New Roman" w:hAnsi="Times New Roman" w:cs="Times New Roman"/>
           <w:lang w:val="uk-UA"/>
         </w:rPr>
       </w:pPr>
@@ -38685,22 +38619,14 @@
         </w:rPr>
         <w:t>:</w:t>
       </w:r>
-    </w:p>
-    <w:p>
-      <w:pPr>
-        <w:rPr>
-          <w:rFonts w:ascii="Times New Roman" w:hAnsi="Times New Roman" w:cs="Times New Roman"/>
-          <w:lang w:val="uk-UA"/>
-        </w:rPr>
-      </w:pPr>
-    </w:p>
-    <w:p>
-      <w:pPr>
-        <w:rPr>
-          <w:rFonts w:ascii="Times New Roman" w:hAnsi="Times New Roman" w:cs="Times New Roman"/>
-          <w:lang w:val="uk-UA"/>
-        </w:rPr>
-      </w:pPr>
+      <w:hyperlink r:id="rId31" w:history="1">
+        <w:r>
+          <w:rPr>
+            <w:rStyle w:val="ae"/>
+          </w:rPr>
+          <w:t>https://github.com/artificial-intelligence-department/ai_programming_playground_2026/pull/258/changes - diff-825ccfef07ecbc9eaa6fc08a40dcf602b92b5a2b889f6143bf6ca4672a8d3630</w:t>
+        </w:r>
+      </w:hyperlink>
     </w:p>
     <w:p>
       <w:pPr>
@@ -38896,7 +38822,7 @@
                     <pic:cNvPicPr/>
                   </pic:nvPicPr>
                   <pic:blipFill>
-                    <a:blip r:embed="rId25">
+                    <a:blip r:embed="rId32">
                       <a:extLst>
                         <a:ext uri="{28A0092B-C50C-407E-A947-70E740481C1C}">
                           <a14:useLocalDpi xmlns:a14="http://schemas.microsoft.com/office/drawing/2010/main" val="0"/>
@@ -39278,7 +39204,7 @@
                     <pic:cNvPicPr/>
                   </pic:nvPicPr>
                   <pic:blipFill>
-                    <a:blip r:embed="rId26">
+                    <a:blip r:embed="rId33">
                       <a:extLst>
                         <a:ext uri="{28A0092B-C50C-407E-A947-70E740481C1C}">
                           <a14:useLocalDpi xmlns:a14="http://schemas.microsoft.com/office/drawing/2010/main" val="0"/>
@@ -39753,7 +39679,7 @@
                     <pic:cNvPicPr/>
                   </pic:nvPicPr>
                   <pic:blipFill>
-                    <a:blip r:embed="rId27">
+                    <a:blip r:embed="rId34">
                       <a:extLst>
                         <a:ext uri="{28A0092B-C50C-407E-A947-70E740481C1C}">
                           <a14:useLocalDpi xmlns:a14="http://schemas.microsoft.com/office/drawing/2010/main" val="0"/>
@@ -40341,7 +40267,7 @@
                     <pic:cNvPicPr/>
                   </pic:nvPicPr>
                   <pic:blipFill>
-                    <a:blip r:embed="rId28">
+                    <a:blip r:embed="rId35">
                       <a:extLst>
                         <a:ext uri="{28A0092B-C50C-407E-A947-70E740481C1C}">
                           <a14:useLocalDpi xmlns:a14="http://schemas.microsoft.com/office/drawing/2010/main" val="0"/>
@@ -41260,7 +41186,7 @@
                     <pic:cNvPicPr/>
                   </pic:nvPicPr>
                   <pic:blipFill>
-                    <a:blip r:embed="rId29">
+                    <a:blip r:embed="rId36">
                       <a:extLst>
                         <a:ext uri="{28A0092B-C50C-407E-A947-70E740481C1C}">
                           <a14:useLocalDpi xmlns:a14="http://schemas.microsoft.com/office/drawing/2010/main" val="0"/>
@@ -41953,7 +41879,7 @@
                     <pic:cNvPicPr/>
                   </pic:nvPicPr>
                   <pic:blipFill>
-                    <a:blip r:embed="rId30" cstate="print">
+                    <a:blip r:embed="rId37" cstate="print">
                       <a:extLst>
                         <a:ext uri="{28A0092B-C50C-407E-A947-70E740481C1C}">
                           <a14:useLocalDpi xmlns:a14="http://schemas.microsoft.com/office/drawing/2010/main" val="0"/>
@@ -42385,7 +42311,7 @@
                     <pic:cNvPicPr/>
                   </pic:nvPicPr>
                   <pic:blipFill>
-                    <a:blip r:embed="rId31" cstate="print">
+                    <a:blip r:embed="rId38" cstate="print">
                       <a:extLst>
                         <a:ext uri="{28A0092B-C50C-407E-A947-70E740481C1C}">
                           <a14:useLocalDpi xmlns:a14="http://schemas.microsoft.com/office/drawing/2010/main" val="0"/>
@@ -46358,7 +46284,7 @@
                     <pic:cNvPicPr/>
                   </pic:nvPicPr>
                   <pic:blipFill>
-                    <a:blip r:embed="rId32">
+                    <a:blip r:embed="rId39">
                       <a:extLst>
                         <a:ext uri="{28A0092B-C50C-407E-A947-70E740481C1C}">
                           <a14:useLocalDpi xmlns:a14="http://schemas.microsoft.com/office/drawing/2010/main" val="0"/>
@@ -46449,7 +46375,7 @@
                     <pic:cNvPicPr/>
                   </pic:nvPicPr>
                   <pic:blipFill>
-                    <a:blip r:embed="rId33">
+                    <a:blip r:embed="rId40">
                       <a:extLst>
                         <a:ext uri="{28A0092B-C50C-407E-A947-70E740481C1C}">
                           <a14:useLocalDpi xmlns:a14="http://schemas.microsoft.com/office/drawing/2010/main" val="0"/>
@@ -46539,7 +46465,7 @@
                     <pic:cNvPicPr/>
                   </pic:nvPicPr>
                   <pic:blipFill>
-                    <a:blip r:embed="rId34">
+                    <a:blip r:embed="rId41">
                       <a:extLst>
                         <a:ext uri="{28A0092B-C50C-407E-A947-70E740481C1C}">
                           <a14:useLocalDpi xmlns:a14="http://schemas.microsoft.com/office/drawing/2010/main" val="0"/>
@@ -46629,7 +46555,7 @@
                     <pic:cNvPicPr/>
                   </pic:nvPicPr>
                   <pic:blipFill>
-                    <a:blip r:embed="rId35">
+                    <a:blip r:embed="rId42">
                       <a:extLst>
                         <a:ext uri="{28A0092B-C50C-407E-A947-70E740481C1C}">
                           <a14:useLocalDpi xmlns:a14="http://schemas.microsoft.com/office/drawing/2010/main" val="0"/>
@@ -46719,7 +46645,7 @@
                     <pic:cNvPicPr/>
                   </pic:nvPicPr>
                   <pic:blipFill>
-                    <a:blip r:embed="rId36">
+                    <a:blip r:embed="rId43">
                       <a:extLst>
                         <a:ext uri="{28A0092B-C50C-407E-A947-70E740481C1C}">
                           <a14:useLocalDpi xmlns:a14="http://schemas.microsoft.com/office/drawing/2010/main" val="0"/>
@@ -46809,7 +46735,7 @@
                     <pic:cNvPicPr/>
                   </pic:nvPicPr>
                   <pic:blipFill>
-                    <a:blip r:embed="rId37">
+                    <a:blip r:embed="rId44">
                       <a:extLst>
                         <a:ext uri="{28A0092B-C50C-407E-A947-70E740481C1C}">
                           <a14:useLocalDpi xmlns:a14="http://schemas.microsoft.com/office/drawing/2010/main" val="0"/>
@@ -46899,7 +46825,7 @@
                     <pic:cNvPicPr/>
                   </pic:nvPicPr>
                   <pic:blipFill>
-                    <a:blip r:embed="rId38">
+                    <a:blip r:embed="rId45">
                       <a:extLst>
                         <a:ext uri="{28A0092B-C50C-407E-A947-70E740481C1C}">
                           <a14:useLocalDpi xmlns:a14="http://schemas.microsoft.com/office/drawing/2010/main" val="0"/>
@@ -46990,7 +46916,7 @@
                     <pic:cNvPicPr/>
                   </pic:nvPicPr>
                   <pic:blipFill>
-                    <a:blip r:embed="rId39">
+                    <a:blip r:embed="rId46">
                       <a:extLst>
                         <a:ext uri="{28A0092B-C50C-407E-A947-70E740481C1C}">
                           <a14:useLocalDpi xmlns:a14="http://schemas.microsoft.com/office/drawing/2010/main" val="0"/>
@@ -47080,7 +47006,7 @@
                     <pic:cNvPicPr/>
                   </pic:nvPicPr>
                   <pic:blipFill>
-                    <a:blip r:embed="rId40">
+                    <a:blip r:embed="rId47">
                       <a:extLst>
                         <a:ext uri="{28A0092B-C50C-407E-A947-70E740481C1C}">
                           <a14:useLocalDpi xmlns:a14="http://schemas.microsoft.com/office/drawing/2010/main" val="0"/>
@@ -47170,7 +47096,7 @@
                     <pic:cNvPicPr/>
                   </pic:nvPicPr>
                   <pic:blipFill>
-                    <a:blip r:embed="rId41">
+                    <a:blip r:embed="rId48">
                       <a:extLst>
                         <a:ext uri="{28A0092B-C50C-407E-A947-70E740481C1C}">
                           <a14:useLocalDpi xmlns:a14="http://schemas.microsoft.com/office/drawing/2010/main" val="0"/>
@@ -47260,7 +47186,7 @@
                     <pic:cNvPicPr/>
                   </pic:nvPicPr>
                   <pic:blipFill>
-                    <a:blip r:embed="rId42">
+                    <a:blip r:embed="rId49">
                       <a:extLst>
                         <a:ext uri="{28A0092B-C50C-407E-A947-70E740481C1C}">
                           <a14:useLocalDpi xmlns:a14="http://schemas.microsoft.com/office/drawing/2010/main" val="0"/>
@@ -47359,7 +47285,7 @@
                     <pic:cNvPicPr/>
                   </pic:nvPicPr>
                   <pic:blipFill>
-                    <a:blip r:embed="rId43">
+                    <a:blip r:embed="rId50">
                       <a:extLst>
                         <a:ext uri="{28A0092B-C50C-407E-A947-70E740481C1C}">
                           <a14:useLocalDpi xmlns:a14="http://schemas.microsoft.com/office/drawing/2010/main" val="0"/>
@@ -47450,7 +47376,7 @@
                     <pic:cNvPicPr/>
                   </pic:nvPicPr>
                   <pic:blipFill>
-                    <a:blip r:embed="rId44">
+                    <a:blip r:embed="rId51">
                       <a:extLst>
                         <a:ext uri="{28A0092B-C50C-407E-A947-70E740481C1C}">
                           <a14:useLocalDpi xmlns:a14="http://schemas.microsoft.com/office/drawing/2010/main" val="0"/>
@@ -47540,7 +47466,7 @@
                     <pic:cNvPicPr/>
                   </pic:nvPicPr>
                   <pic:blipFill>
-                    <a:blip r:embed="rId45">
+                    <a:blip r:embed="rId52">
                       <a:extLst>
                         <a:ext uri="{28A0092B-C50C-407E-A947-70E740481C1C}">
                           <a14:useLocalDpi xmlns:a14="http://schemas.microsoft.com/office/drawing/2010/main" val="0"/>
@@ -47630,7 +47556,7 @@
                     <pic:cNvPicPr/>
                   </pic:nvPicPr>
                   <pic:blipFill>
-                    <a:blip r:embed="rId46">
+                    <a:blip r:embed="rId53">
                       <a:extLst>
                         <a:ext uri="{28A0092B-C50C-407E-A947-70E740481C1C}">
                           <a14:useLocalDpi xmlns:a14="http://schemas.microsoft.com/office/drawing/2010/main" val="0"/>
@@ -47720,7 +47646,7 @@
                     <pic:cNvPicPr/>
                   </pic:nvPicPr>
                   <pic:blipFill>
-                    <a:blip r:embed="rId47">
+                    <a:blip r:embed="rId54">
                       <a:extLst>
                         <a:ext uri="{28A0092B-C50C-407E-A947-70E740481C1C}">
                           <a14:useLocalDpi xmlns:a14="http://schemas.microsoft.com/office/drawing/2010/main" val="0"/>
@@ -47901,7 +47827,7 @@
           <w:lang w:val="en-US"/>
         </w:rPr>
         <w:drawing>
-          <wp:anchor distT="0" distB="0" distL="114300" distR="114300" simplePos="0" relativeHeight="251717632" behindDoc="0" locked="0" layoutInCell="1" allowOverlap="1" wp14:anchorId="6BAC2C85" wp14:editId="30983CC9">
+          <wp:anchor distT="0" distB="0" distL="114300" distR="114300" simplePos="0" relativeHeight="251717632" behindDoc="0" locked="0" layoutInCell="1" allowOverlap="1" wp14:anchorId="6BAC2C85" wp14:editId="348619ED">
             <wp:simplePos x="0" y="0"/>
             <wp:positionH relativeFrom="margin">
               <wp:align>left</wp:align>
@@ -47932,7 +47858,7 @@
                     <pic:cNvPicPr/>
                   </pic:nvPicPr>
                   <pic:blipFill>
-                    <a:blip r:embed="rId48" cstate="print">
+                    <a:blip r:embed="rId55" cstate="print">
                       <a:extLst>
                         <a:ext uri="{28A0092B-C50C-407E-A947-70E740481C1C}">
                           <a14:useLocalDpi xmlns:a14="http://schemas.microsoft.com/office/drawing/2010/main" val="0"/>
@@ -48049,7 +47975,7 @@
           <w:lang w:val="en-US"/>
         </w:rPr>
         <w:drawing>
-          <wp:anchor distT="0" distB="0" distL="114300" distR="114300" simplePos="0" relativeHeight="251718656" behindDoc="1" locked="0" layoutInCell="1" allowOverlap="1" wp14:anchorId="5B548F20" wp14:editId="6563614A">
+          <wp:anchor distT="0" distB="0" distL="114300" distR="114300" simplePos="0" relativeHeight="251718656" behindDoc="1" locked="0" layoutInCell="1" allowOverlap="1" wp14:anchorId="5B548F20" wp14:editId="7C53C3A9">
             <wp:simplePos x="0" y="0"/>
             <wp:positionH relativeFrom="margin">
               <wp:align>center</wp:align>
@@ -48080,7 +48006,7 @@
                     <pic:cNvPicPr/>
                   </pic:nvPicPr>
                   <pic:blipFill>
-                    <a:blip r:embed="rId49" cstate="print">
+                    <a:blip r:embed="rId56" cstate="print">
                       <a:extLst>
                         <a:ext uri="{28A0092B-C50C-407E-A947-70E740481C1C}">
                           <a14:useLocalDpi xmlns:a14="http://schemas.microsoft.com/office/drawing/2010/main" val="0"/>
@@ -48408,7 +48334,7 @@
                     <pic:cNvPicPr/>
                   </pic:nvPicPr>
                   <pic:blipFill>
-                    <a:blip r:embed="rId50" cstate="print">
+                    <a:blip r:embed="rId57" cstate="print">
                       <a:extLst>
                         <a:ext uri="{28A0092B-C50C-407E-A947-70E740481C1C}">
                           <a14:useLocalDpi xmlns:a14="http://schemas.microsoft.com/office/drawing/2010/main" val="0"/>
@@ -48626,7 +48552,7 @@
                     <pic:cNvPicPr/>
                   </pic:nvPicPr>
                   <pic:blipFill>
-                    <a:blip r:embed="rId51"/>
+                    <a:blip r:embed="rId58"/>
                     <a:stretch>
                       <a:fillRect/>
                     </a:stretch>
@@ -48722,7 +48648,7 @@
                     <pic:cNvPicPr/>
                   </pic:nvPicPr>
                   <pic:blipFill>
-                    <a:blip r:embed="rId52"/>
+                    <a:blip r:embed="rId59"/>
                     <a:stretch>
                       <a:fillRect/>
                     </a:stretch>
@@ -52996,6 +52922,7 @@
   <w:style w:type="character" w:default="1" w:styleId="a0">
     <w:name w:val="Default Paragraph Font"/>
     <w:uiPriority w:val="1"/>
+    <w:semiHidden/>
     <w:unhideWhenUsed/>
   </w:style>
   <w:style w:type="table" w:default="1" w:styleId="a1">

</xml_diff>